<commit_message>
Handleiding: hub/operatie-schermen toegevoegd (intake, manifesten, lockers)
- 3 echte ops-screenshots (als hub@) via gen-help-screenshots.mjs (+ONLY-filter):
  ops_intake, ops_manifests, ops_lockers → public/help/.
- Ops-gids in help.ts opgesplitst en geïllustreerd: Intake & verzegelen
  (ops_intake), Manifesten & legs (ops_manifests), Lockers & tijdslots
  (ops_lockers), Beoordelingswachtrij (control). NL + EN.
- Geïllustreerde PDF's (NL+EN) opnieuw gegenereerd met de ops-beelden erin
  (docs/*.{docx,pdf} + served public/handleiding/handleiding-*.pdf).

Login in het screenshot-script nu via requestSubmit (betrouwbaarder dan click).
Typecheck schoon.

Co-Authored-By: Claude Opus 4.8 <noreply@anthropic.com>
</commit_message>
<xml_diff>
--- a/docs/BugaWuga-handleiding-EN.docx
+++ b/docs/BugaWuga-handleiding-EN.docx
@@ -2232,6 +2232,36 @@
           <w:sz w:val="20"/>
           <w:szCs w:val="20"/>
         </w:rPr>
+        <w:t xml:space="preserve">Work list</w:t>
+      </w:r>
+      <w:r>
+        <w:rPr>
+          <w:rFonts w:ascii="Calibri" w:cs="Calibri" w:eastAsia="Calibri" w:hAnsi="Calibri"/>
+          <w:color w:val="23201A"/>
+          <w:sz w:val="20"/>
+          <w:szCs w:val="20"/>
+        </w:rPr>
+        <w:t xml:space="preserve"> — “Hub &amp; intake” shows the booked shipments needing intake/inspection, plus the hubs &amp; service points in the corridor.</w:t>
+      </w:r>
+    </w:p>
+    <w:p>
+      <w:pPr>
+        <w:pStyle w:val="ListParagraph"/>
+        <w:numPr>
+          <w:ilvl w:val="0"/>
+          <w:numId w:val="2"/>
+        </w:numPr>
+        <w:spacing w:after="20"/>
+      </w:pPr>
+      <w:r>
+        <w:rPr>
+          <w:rFonts w:ascii="Calibri" w:cs="Calibri" w:eastAsia="Calibri" w:hAnsi="Calibri"/>
+          <w:b/>
+          <w:bCs/>
+          <w:color w:val="23201A"/>
+          <w:sz w:val="20"/>
+          <w:szCs w:val="20"/>
+        </w:rPr>
         <w:t xml:space="preserve">Inspection</w:t>
       </w:r>
       <w:r>
@@ -2241,7 +2271,7 @@
           <w:sz w:val="20"/>
           <w:szCs w:val="20"/>
         </w:rPr>
-        <w:t xml:space="preserve"> — on a booked shipment, run the checklist (contents, quantity, condition, batteries, liquids, declaration).</w:t>
+        <w:t xml:space="preserve"> — on a shipment, run the checklist (contents, quantity, condition, batteries, liquids, declaration).</w:t>
       </w:r>
     </w:p>
     <w:p>
@@ -2302,128 +2332,6 @@
           <w:szCs w:val="20"/>
         </w:rPr>
         <w:t xml:space="preserve"> — every step and handover is recorded in an immutable log.</w:t>
-      </w:r>
-    </w:p>
-    <w:p>
-      <w:pPr>
-        <w:spacing w:after="40" w:before="150"/>
-      </w:pPr>
-      <w:r>
-        <w:rPr>
-          <w:rFonts w:ascii="Calibri" w:cs="Calibri" w:eastAsia="Calibri" w:hAnsi="Calibri"/>
-          <w:b/>
-          <w:bCs/>
-          <w:color w:val="4F7A1B"/>
-          <w:sz w:val="18"/>
-          <w:szCs w:val="18"/>
-        </w:rPr>
-        <w:t xml:space="preserve">Manifests, legs, lockers</w:t>
-      </w:r>
-    </w:p>
-    <w:p>
-      <w:pPr>
-        <w:pStyle w:val="ListParagraph"/>
-        <w:numPr>
-          <w:ilvl w:val="0"/>
-          <w:numId w:val="2"/>
-        </w:numPr>
-        <w:spacing w:after="20"/>
-      </w:pPr>
-      <w:r>
-        <w:rPr>
-          <w:rFonts w:ascii="Calibri" w:cs="Calibri" w:eastAsia="Calibri" w:hAnsi="Calibri"/>
-          <w:b/>
-          <w:bCs/>
-          <w:color w:val="23201A"/>
-          <w:sz w:val="20"/>
-          <w:szCs w:val="20"/>
-        </w:rPr>
-        <w:t xml:space="preserve">Manifests &amp; legs</w:t>
-      </w:r>
-      <w:r>
-        <w:rPr>
-          <w:rFonts w:ascii="Calibri" w:cs="Calibri" w:eastAsia="Calibri" w:hAnsi="Calibri"/>
-          <w:color w:val="23201A"/>
-          <w:sz w:val="20"/>
-          <w:szCs w:val="20"/>
-        </w:rPr>
-        <w:t xml:space="preserve"> — create a manifest (e.g. a flight), link shipments and advance the status: seal → depart → arrive → close. All linked shipments follow.</w:t>
-      </w:r>
-    </w:p>
-    <w:p>
-      <w:pPr>
-        <w:pStyle w:val="ListParagraph"/>
-        <w:numPr>
-          <w:ilvl w:val="0"/>
-          <w:numId w:val="2"/>
-        </w:numPr>
-        <w:spacing w:after="20"/>
-      </w:pPr>
-      <w:r>
-        <w:rPr>
-          <w:rFonts w:ascii="Calibri" w:cs="Calibri" w:eastAsia="Calibri" w:hAnsi="Calibri"/>
-          <w:b/>
-          <w:bCs/>
-          <w:color w:val="23201A"/>
-          <w:sz w:val="20"/>
-          <w:szCs w:val="20"/>
-        </w:rPr>
-        <w:t xml:space="preserve">Lockers &amp; timeslots</w:t>
-      </w:r>
-      <w:r>
-        <w:rPr>
-          <w:rFonts w:ascii="Calibri" w:cs="Calibri" w:eastAsia="Calibri" w:hAnsi="Calibri"/>
-          <w:color w:val="23201A"/>
-          <w:sz w:val="20"/>
-          <w:szCs w:val="20"/>
-        </w:rPr>
-        <w:t xml:space="preserve"> — assign a package to a free compartment (with a pin), book a timeslot and run a stock reconciliation (scan → MATCH / UNEXPECTED / MISSING).</w:t>
-      </w:r>
-    </w:p>
-    <w:p>
-      <w:pPr>
-        <w:spacing w:after="40" w:before="150"/>
-      </w:pPr>
-      <w:r>
-        <w:rPr>
-          <w:rFonts w:ascii="Calibri" w:cs="Calibri" w:eastAsia="Calibri" w:hAnsi="Calibri"/>
-          <w:b/>
-          <w:bCs/>
-          <w:color w:val="4F7A1B"/>
-          <w:sz w:val="18"/>
-          <w:szCs w:val="18"/>
-        </w:rPr>
-        <w:t xml:space="preserve">Review queue</w:t>
-      </w:r>
-    </w:p>
-    <w:p>
-      <w:pPr>
-        <w:pStyle w:val="ListParagraph"/>
-        <w:numPr>
-          <w:ilvl w:val="0"/>
-          <w:numId w:val="2"/>
-        </w:numPr>
-        <w:spacing w:after="20"/>
-      </w:pPr>
-      <w:r>
-        <w:rPr>
-          <w:rFonts w:ascii="Calibri" w:cs="Calibri" w:eastAsia="Calibri" w:hAnsi="Calibri"/>
-          <w:b/>
-          <w:bCs/>
-          <w:color w:val="23201A"/>
-          <w:sz w:val="20"/>
-          <w:szCs w:val="20"/>
-        </w:rPr>
-        <w:t xml:space="preserve">Control Center</w:t>
-      </w:r>
-      <w:r>
-        <w:rPr>
-          <w:rFonts w:ascii="Calibri" w:cs="Calibri" w:eastAsia="Calibri" w:hAnsi="Calibri"/>
-          <w:color w:val="23201A"/>
-          <w:sz w:val="20"/>
-          <w:szCs w:val="20"/>
-        </w:rPr>
-        <w:t xml:space="preserve"> — handle the queue of shipments needing review and approve or reject them.</w:t>
       </w:r>
     </w:p>
     <w:p>
@@ -2473,56 +2381,6 @@
     </w:p>
     <w:p>
       <w:pPr>
-        <w:spacing w:after="30" w:before="300"/>
-      </w:pPr>
-      <w:r>
-        <w:rPr>
-          <w:rFonts w:ascii="Calibri" w:cs="Calibri" w:eastAsia="Calibri" w:hAnsi="Calibri"/>
-          <w:b/>
-          <w:bCs/>
-          <w:color w:val="4F7A1B"/>
-          <w:spacing w:val="40"/>
-          <w:sz w:val="15"/>
-          <w:szCs w:val="15"/>
-        </w:rPr>
-        <w:t xml:space="preserve">ROLE · MANAGEMENT</w:t>
-      </w:r>
-    </w:p>
-    <w:p>
-      <w:pPr>
-        <w:pStyle w:val="Heading2"/>
-        <w:spacing w:after="40" w:before="10"/>
-      </w:pPr>
-      <w:r>
-        <w:rPr>
-          <w:rFonts w:ascii="Georgia" w:cs="Georgia" w:eastAsia="Georgia" w:hAnsi="Georgia"/>
-          <w:b/>
-          <w:bCs/>
-          <w:color w:val="23201A"/>
-          <w:sz w:val="28"/>
-          <w:szCs w:val="28"/>
-        </w:rPr>
-        <w:t xml:space="preserve">🛡️  Management — steering &amp; oversight</w:t>
-      </w:r>
-    </w:p>
-    <w:p>
-      <w:pPr>
-        <w:spacing w:after="120"/>
-      </w:pPr>
-      <w:r>
-        <w:rPr>
-          <w:rFonts w:ascii="Calibri" w:cs="Calibri" w:eastAsia="Calibri" w:hAnsi="Calibri"/>
-          <w:i/>
-          <w:iCs/>
-          <w:color w:val="6F695B"/>
-          <w:sz w:val="20"/>
-          <w:szCs w:val="20"/>
-        </w:rPr>
-        <w:t xml:space="preserve">Overview, safety, usage insight and content.</w:t>
-      </w:r>
-    </w:p>
-    <w:p>
-      <w:pPr>
         <w:spacing w:after="40" w:before="150"/>
       </w:pPr>
       <w:r>
@@ -2534,97 +2392,67 @@
           <w:sz w:val="18"/>
           <w:szCs w:val="18"/>
         </w:rPr>
-        <w:t xml:space="preserve">Control Center: oversight &amp; safety</w:t>
-      </w:r>
-    </w:p>
-    <w:p>
-      <w:pPr>
-        <w:pStyle w:val="ListParagraph"/>
-        <w:numPr>
-          <w:ilvl w:val="0"/>
-          <w:numId w:val="2"/>
-        </w:numPr>
-        <w:spacing w:after="20"/>
-      </w:pPr>
-      <w:r>
-        <w:rPr>
-          <w:rFonts w:ascii="Calibri" w:cs="Calibri" w:eastAsia="Calibri" w:hAnsi="Calibri"/>
-          <w:b/>
-          <w:bCs/>
-          <w:color w:val="23201A"/>
-          <w:sz w:val="20"/>
-          <w:szCs w:val="20"/>
-        </w:rPr>
-        <w:t xml:space="preserve">Review</w:t>
-      </w:r>
-      <w:r>
-        <w:rPr>
-          <w:rFonts w:ascii="Calibri" w:cs="Calibri" w:eastAsia="Calibri" w:hAnsi="Calibri"/>
-          <w:color w:val="23201A"/>
-          <w:sz w:val="20"/>
-          <w:szCs w:val="20"/>
-        </w:rPr>
-        <w:t xml:space="preserve"> — work through the review queue; override with a reason where needed.</w:t>
-      </w:r>
-    </w:p>
-    <w:p>
-      <w:pPr>
-        <w:pStyle w:val="ListParagraph"/>
-        <w:numPr>
-          <w:ilvl w:val="0"/>
-          <w:numId w:val="2"/>
-        </w:numPr>
-        <w:spacing w:after="20"/>
-      </w:pPr>
-      <w:r>
-        <w:rPr>
-          <w:rFonts w:ascii="Calibri" w:cs="Calibri" w:eastAsia="Calibri" w:hAnsi="Calibri"/>
-          <w:b/>
-          <w:bCs/>
-          <w:color w:val="23201A"/>
-          <w:sz w:val="20"/>
-          <w:szCs w:val="20"/>
-        </w:rPr>
-        <w:t xml:space="preserve">Kill switch</w:t>
-      </w:r>
-      <w:r>
-        <w:rPr>
-          <w:rFonts w:ascii="Calibri" w:cs="Calibri" w:eastAsia="Calibri" w:hAnsi="Calibri"/>
-          <w:color w:val="23201A"/>
-          <w:sz w:val="20"/>
-          <w:szCs w:val="20"/>
-        </w:rPr>
-        <w:t xml:space="preserve"> — set a per-corridor emergency stop when necessary.</w:t>
-      </w:r>
-    </w:p>
-    <w:p>
-      <w:pPr>
-        <w:pStyle w:val="ListParagraph"/>
-        <w:numPr>
-          <w:ilvl w:val="0"/>
-          <w:numId w:val="2"/>
-        </w:numPr>
-        <w:spacing w:after="20"/>
-      </w:pPr>
-      <w:r>
-        <w:rPr>
-          <w:rFonts w:ascii="Calibri" w:cs="Calibri" w:eastAsia="Calibri" w:hAnsi="Calibri"/>
-          <w:b/>
-          <w:bCs/>
-          <w:color w:val="23201A"/>
-          <w:sz w:val="20"/>
-          <w:szCs w:val="20"/>
-        </w:rPr>
-        <w:t xml:space="preserve">Reports</w:t>
-      </w:r>
-      <w:r>
-        <w:rPr>
-          <w:rFonts w:ascii="Calibri" w:cs="Calibri" w:eastAsia="Calibri" w:hAnsi="Calibri"/>
-          <w:color w:val="23201A"/>
-          <w:sz w:val="20"/>
-          <w:szCs w:val="20"/>
-        </w:rPr>
-        <w:t xml:space="preserve"> — resolve 🚩 reported users/listings.</w:t>
+        <w:t xml:space="preserve">Manifests &amp; legs</w:t>
+      </w:r>
+    </w:p>
+    <w:p>
+      <w:pPr>
+        <w:pStyle w:val="ListParagraph"/>
+        <w:numPr>
+          <w:ilvl w:val="0"/>
+          <w:numId w:val="2"/>
+        </w:numPr>
+        <w:spacing w:after="20"/>
+      </w:pPr>
+      <w:r>
+        <w:rPr>
+          <w:rFonts w:ascii="Calibri" w:cs="Calibri" w:eastAsia="Calibri" w:hAnsi="Calibri"/>
+          <w:b/>
+          <w:bCs/>
+          <w:color w:val="23201A"/>
+          <w:sz w:val="20"/>
+          <w:szCs w:val="20"/>
+        </w:rPr>
+        <w:t xml:space="preserve">Create a manifest</w:t>
+      </w:r>
+      <w:r>
+        <w:rPr>
+          <w:rFonts w:ascii="Calibri" w:cs="Calibri" w:eastAsia="Calibri" w:hAnsi="Calibri"/>
+          <w:color w:val="23201A"/>
+          <w:sz w:val="20"/>
+          <w:szCs w:val="20"/>
+        </w:rPr>
+        <w:t xml:space="preserve"> — make a manifest (e.g. a flight) and link shipments to it.</w:t>
+      </w:r>
+    </w:p>
+    <w:p>
+      <w:pPr>
+        <w:pStyle w:val="ListParagraph"/>
+        <w:numPr>
+          <w:ilvl w:val="0"/>
+          <w:numId w:val="2"/>
+        </w:numPr>
+        <w:spacing w:after="20"/>
+      </w:pPr>
+      <w:r>
+        <w:rPr>
+          <w:rFonts w:ascii="Calibri" w:cs="Calibri" w:eastAsia="Calibri" w:hAnsi="Calibri"/>
+          <w:b/>
+          <w:bCs/>
+          <w:color w:val="23201A"/>
+          <w:sz w:val="20"/>
+          <w:szCs w:val="20"/>
+        </w:rPr>
+        <w:t xml:space="preserve">Advance the status</w:t>
+      </w:r>
+      <w:r>
+        <w:rPr>
+          <w:rFonts w:ascii="Calibri" w:cs="Calibri" w:eastAsia="Calibri" w:hAnsi="Calibri"/>
+          <w:color w:val="23201A"/>
+          <w:sz w:val="20"/>
+          <w:szCs w:val="20"/>
+        </w:rPr>
+        <w:t xml:space="preserve"> — seal → depart → arrive → close. All linked shipments and their custody follow.</w:t>
       </w:r>
     </w:p>
     <w:p>
@@ -2650,7 +2478,7 @@
                     </pic:cNvPicPr>
                   </pic:nvPicPr>
                   <pic:blipFill>
-                    <a:blip r:embed="rId14" cstate="none"/>
+                    <a:blip r:embed="rId15" cstate="none"/>
                     <a:srcRect/>
                     <a:stretch>
                       <a:fillRect/>
@@ -2685,67 +2513,67 @@
           <w:sz w:val="18"/>
           <w:szCs w:val="18"/>
         </w:rPr>
-        <w:t xml:space="preserve">Usage &amp; activity (dashboard)</w:t>
-      </w:r>
-    </w:p>
-    <w:p>
-      <w:pPr>
-        <w:pStyle w:val="ListParagraph"/>
-        <w:numPr>
-          <w:ilvl w:val="0"/>
-          <w:numId w:val="2"/>
-        </w:numPr>
-        <w:spacing w:after="20"/>
-      </w:pPr>
-      <w:r>
-        <w:rPr>
-          <w:rFonts w:ascii="Calibri" w:cs="Calibri" w:eastAsia="Calibri" w:hAnsi="Calibri"/>
-          <w:b/>
-          <w:bCs/>
-          <w:color w:val="23201A"/>
-          <w:sz w:val="20"/>
-          <w:szCs w:val="20"/>
-        </w:rPr>
-        <w:t xml:space="preserve">Active users</w:t>
-      </w:r>
-      <w:r>
-        <w:rPr>
-          <w:rFonts w:ascii="Calibri" w:cs="Calibri" w:eastAsia="Calibri" w:hAnsi="Calibri"/>
-          <w:color w:val="23201A"/>
-          <w:sz w:val="20"/>
-          <w:szCs w:val="20"/>
-        </w:rPr>
-        <w:t xml:space="preserve"> — see how many are active (24h/7d/30d) and who has been active, with last login and actions per member.</w:t>
-      </w:r>
-    </w:p>
-    <w:p>
-      <w:pPr>
-        <w:pStyle w:val="ListParagraph"/>
-        <w:numPr>
-          <w:ilvl w:val="0"/>
-          <w:numId w:val="2"/>
-        </w:numPr>
-        <w:spacing w:after="20"/>
-      </w:pPr>
-      <w:r>
-        <w:rPr>
-          <w:rFonts w:ascii="Calibri" w:cs="Calibri" w:eastAsia="Calibri" w:hAnsi="Calibri"/>
-          <w:b/>
-          <w:bCs/>
-          <w:color w:val="23201A"/>
-          <w:sz w:val="20"/>
-          <w:szCs w:val="20"/>
-        </w:rPr>
-        <w:t xml:space="preserve">Funnel &amp; behaviour</w:t>
-      </w:r>
-      <w:r>
-        <w:rPr>
-          <w:rFonts w:ascii="Calibri" w:cs="Calibri" w:eastAsia="Calibri" w:hAnsi="Calibri"/>
-          <w:color w:val="23201A"/>
-          <w:sz w:val="20"/>
-          <w:szCs w:val="20"/>
-        </w:rPr>
-        <w:t xml:space="preserve"> — follow the activity funnel (sign-up → … → delivery) and behaviour (page views, “check used”, clicks).</w:t>
+        <w:t xml:space="preserve">Lockers &amp; timeslots</w:t>
+      </w:r>
+    </w:p>
+    <w:p>
+      <w:pPr>
+        <w:pStyle w:val="ListParagraph"/>
+        <w:numPr>
+          <w:ilvl w:val="0"/>
+          <w:numId w:val="2"/>
+        </w:numPr>
+        <w:spacing w:after="20"/>
+      </w:pPr>
+      <w:r>
+        <w:rPr>
+          <w:rFonts w:ascii="Calibri" w:cs="Calibri" w:eastAsia="Calibri" w:hAnsi="Calibri"/>
+          <w:b/>
+          <w:bCs/>
+          <w:color w:val="23201A"/>
+          <w:sz w:val="20"/>
+          <w:szCs w:val="20"/>
+        </w:rPr>
+        <w:t xml:space="preserve">Assign a compartment</w:t>
+      </w:r>
+      <w:r>
+        <w:rPr>
+          <w:rFonts w:ascii="Calibri" w:cs="Calibri" w:eastAsia="Calibri" w:hAnsi="Calibri"/>
+          <w:color w:val="23201A"/>
+          <w:sz w:val="20"/>
+          <w:szCs w:val="20"/>
+        </w:rPr>
+        <w:t xml:space="preserve"> — assign a package to a free compartment (with a pin) and book a timeslot.</w:t>
+      </w:r>
+    </w:p>
+    <w:p>
+      <w:pPr>
+        <w:pStyle w:val="ListParagraph"/>
+        <w:numPr>
+          <w:ilvl w:val="0"/>
+          <w:numId w:val="2"/>
+        </w:numPr>
+        <w:spacing w:after="20"/>
+      </w:pPr>
+      <w:r>
+        <w:rPr>
+          <w:rFonts w:ascii="Calibri" w:cs="Calibri" w:eastAsia="Calibri" w:hAnsi="Calibri"/>
+          <w:b/>
+          <w:bCs/>
+          <w:color w:val="23201A"/>
+          <w:sz w:val="20"/>
+          <w:szCs w:val="20"/>
+        </w:rPr>
+        <w:t xml:space="preserve">Stock reconciliation</w:t>
+      </w:r>
+      <w:r>
+        <w:rPr>
+          <w:rFonts w:ascii="Calibri" w:cs="Calibri" w:eastAsia="Calibri" w:hAnsi="Calibri"/>
+          <w:color w:val="23201A"/>
+          <w:sz w:val="20"/>
+          <w:szCs w:val="20"/>
+        </w:rPr>
+        <w:t xml:space="preserve"> — scan/paste references and compare: MATCH / UNEXPECTED / MISSING.</w:t>
       </w:r>
     </w:p>
     <w:p>
@@ -2771,7 +2599,420 @@
                     </pic:cNvPicPr>
                   </pic:nvPicPr>
                   <pic:blipFill>
-                    <a:blip r:embed="rId15" cstate="none"/>
+                    <a:blip r:embed="rId16" cstate="none"/>
+                    <a:srcRect/>
+                    <a:stretch>
+                      <a:fillRect/>
+                    </a:stretch>
+                  </pic:blipFill>
+                  <pic:spPr bwMode="auto">
+                    <a:xfrm>
+                      <a:off x="0" y="0"/>
+                      <a:ext cx="5334000" cy="3638550"/>
+                    </a:xfrm>
+                    <a:prstGeom prst="rect">
+                      <a:avLst/>
+                    </a:prstGeom>
+                  </pic:spPr>
+                </pic:pic>
+              </a:graphicData>
+            </a:graphic>
+          </wp:inline>
+        </w:drawing>
+      </w:r>
+    </w:p>
+    <w:p>
+      <w:pPr>
+        <w:spacing w:after="40" w:before="150"/>
+      </w:pPr>
+      <w:r>
+        <w:rPr>
+          <w:rFonts w:ascii="Calibri" w:cs="Calibri" w:eastAsia="Calibri" w:hAnsi="Calibri"/>
+          <w:b/>
+          <w:bCs/>
+          <w:color w:val="4F7A1B"/>
+          <w:sz w:val="18"/>
+          <w:szCs w:val="18"/>
+        </w:rPr>
+        <w:t xml:space="preserve">Review queue</w:t>
+      </w:r>
+    </w:p>
+    <w:p>
+      <w:pPr>
+        <w:pStyle w:val="ListParagraph"/>
+        <w:numPr>
+          <w:ilvl w:val="0"/>
+          <w:numId w:val="2"/>
+        </w:numPr>
+        <w:spacing w:after="20"/>
+      </w:pPr>
+      <w:r>
+        <w:rPr>
+          <w:rFonts w:ascii="Calibri" w:cs="Calibri" w:eastAsia="Calibri" w:hAnsi="Calibri"/>
+          <w:b/>
+          <w:bCs/>
+          <w:color w:val="23201A"/>
+          <w:sz w:val="20"/>
+          <w:szCs w:val="20"/>
+        </w:rPr>
+        <w:t xml:space="preserve">Control Center</w:t>
+      </w:r>
+      <w:r>
+        <w:rPr>
+          <w:rFonts w:ascii="Calibri" w:cs="Calibri" w:eastAsia="Calibri" w:hAnsi="Calibri"/>
+          <w:color w:val="23201A"/>
+          <w:sz w:val="20"/>
+          <w:szCs w:val="20"/>
+        </w:rPr>
+        <w:t xml:space="preserve"> — handle the queue of shipments needing review and approve or reject them.</w:t>
+      </w:r>
+    </w:p>
+    <w:p>
+      <w:pPr>
+        <w:spacing w:after="140" w:before="60"/>
+      </w:pPr>
+      <w:r>
+        <w:drawing>
+          <wp:inline distT="0" distB="0" distL="0" distR="0">
+            <wp:extent cx="5334000" cy="3638550"/>
+            <wp:effectExtent t="0" r="0" b="0" l="0"/>
+            <wp:docPr id="1" name="" descr="" title=""/>
+            <wp:cNvGraphicFramePr>
+              <a:graphicFrameLocks xmlns:a="http://schemas.openxmlformats.org/drawingml/2006/main" noChangeAspect="1"/>
+            </wp:cNvGraphicFramePr>
+            <a:graphic xmlns:a="http://schemas.openxmlformats.org/drawingml/2006/main">
+              <a:graphicData uri="http://schemas.openxmlformats.org/drawingml/2006/picture">
+                <pic:pic xmlns:pic="http://schemas.openxmlformats.org/drawingml/2006/picture">
+                  <pic:nvPicPr>
+                    <pic:cNvPr id="0" name="" descr=""/>
+                    <pic:cNvPicPr>
+                      <a:picLocks noChangeAspect="1" noChangeArrowheads="1"/>
+                    </pic:cNvPicPr>
+                  </pic:nvPicPr>
+                  <pic:blipFill>
+                    <a:blip r:embed="rId17" cstate="none"/>
+                    <a:srcRect/>
+                    <a:stretch>
+                      <a:fillRect/>
+                    </a:stretch>
+                  </pic:blipFill>
+                  <pic:spPr bwMode="auto">
+                    <a:xfrm>
+                      <a:off x="0" y="0"/>
+                      <a:ext cx="5334000" cy="3638550"/>
+                    </a:xfrm>
+                    <a:prstGeom prst="rect">
+                      <a:avLst/>
+                    </a:prstGeom>
+                  </pic:spPr>
+                </pic:pic>
+              </a:graphicData>
+            </a:graphic>
+          </wp:inline>
+        </w:drawing>
+      </w:r>
+    </w:p>
+    <w:p>
+      <w:pPr>
+        <w:spacing w:after="30" w:before="300"/>
+      </w:pPr>
+      <w:r>
+        <w:rPr>
+          <w:rFonts w:ascii="Calibri" w:cs="Calibri" w:eastAsia="Calibri" w:hAnsi="Calibri"/>
+          <w:b/>
+          <w:bCs/>
+          <w:color w:val="4F7A1B"/>
+          <w:spacing w:val="40"/>
+          <w:sz w:val="15"/>
+          <w:szCs w:val="15"/>
+        </w:rPr>
+        <w:t xml:space="preserve">ROLE · MANAGEMENT</w:t>
+      </w:r>
+    </w:p>
+    <w:p>
+      <w:pPr>
+        <w:pStyle w:val="Heading2"/>
+        <w:spacing w:after="40" w:before="10"/>
+      </w:pPr>
+      <w:r>
+        <w:rPr>
+          <w:rFonts w:ascii="Georgia" w:cs="Georgia" w:eastAsia="Georgia" w:hAnsi="Georgia"/>
+          <w:b/>
+          <w:bCs/>
+          <w:color w:val="23201A"/>
+          <w:sz w:val="28"/>
+          <w:szCs w:val="28"/>
+        </w:rPr>
+        <w:t xml:space="preserve">🛡️  Management — steering &amp; oversight</w:t>
+      </w:r>
+    </w:p>
+    <w:p>
+      <w:pPr>
+        <w:spacing w:after="120"/>
+      </w:pPr>
+      <w:r>
+        <w:rPr>
+          <w:rFonts w:ascii="Calibri" w:cs="Calibri" w:eastAsia="Calibri" w:hAnsi="Calibri"/>
+          <w:i/>
+          <w:iCs/>
+          <w:color w:val="6F695B"/>
+          <w:sz w:val="20"/>
+          <w:szCs w:val="20"/>
+        </w:rPr>
+        <w:t xml:space="preserve">Overview, safety, usage insight and content.</w:t>
+      </w:r>
+    </w:p>
+    <w:p>
+      <w:pPr>
+        <w:spacing w:after="40" w:before="150"/>
+      </w:pPr>
+      <w:r>
+        <w:rPr>
+          <w:rFonts w:ascii="Calibri" w:cs="Calibri" w:eastAsia="Calibri" w:hAnsi="Calibri"/>
+          <w:b/>
+          <w:bCs/>
+          <w:color w:val="4F7A1B"/>
+          <w:sz w:val="18"/>
+          <w:szCs w:val="18"/>
+        </w:rPr>
+        <w:t xml:space="preserve">Control Center: oversight &amp; safety</w:t>
+      </w:r>
+    </w:p>
+    <w:p>
+      <w:pPr>
+        <w:pStyle w:val="ListParagraph"/>
+        <w:numPr>
+          <w:ilvl w:val="0"/>
+          <w:numId w:val="2"/>
+        </w:numPr>
+        <w:spacing w:after="20"/>
+      </w:pPr>
+      <w:r>
+        <w:rPr>
+          <w:rFonts w:ascii="Calibri" w:cs="Calibri" w:eastAsia="Calibri" w:hAnsi="Calibri"/>
+          <w:b/>
+          <w:bCs/>
+          <w:color w:val="23201A"/>
+          <w:sz w:val="20"/>
+          <w:szCs w:val="20"/>
+        </w:rPr>
+        <w:t xml:space="preserve">Review</w:t>
+      </w:r>
+      <w:r>
+        <w:rPr>
+          <w:rFonts w:ascii="Calibri" w:cs="Calibri" w:eastAsia="Calibri" w:hAnsi="Calibri"/>
+          <w:color w:val="23201A"/>
+          <w:sz w:val="20"/>
+          <w:szCs w:val="20"/>
+        </w:rPr>
+        <w:t xml:space="preserve"> — work through the review queue; override with a reason where needed.</w:t>
+      </w:r>
+    </w:p>
+    <w:p>
+      <w:pPr>
+        <w:pStyle w:val="ListParagraph"/>
+        <w:numPr>
+          <w:ilvl w:val="0"/>
+          <w:numId w:val="2"/>
+        </w:numPr>
+        <w:spacing w:after="20"/>
+      </w:pPr>
+      <w:r>
+        <w:rPr>
+          <w:rFonts w:ascii="Calibri" w:cs="Calibri" w:eastAsia="Calibri" w:hAnsi="Calibri"/>
+          <w:b/>
+          <w:bCs/>
+          <w:color w:val="23201A"/>
+          <w:sz w:val="20"/>
+          <w:szCs w:val="20"/>
+        </w:rPr>
+        <w:t xml:space="preserve">Kill switch</w:t>
+      </w:r>
+      <w:r>
+        <w:rPr>
+          <w:rFonts w:ascii="Calibri" w:cs="Calibri" w:eastAsia="Calibri" w:hAnsi="Calibri"/>
+          <w:color w:val="23201A"/>
+          <w:sz w:val="20"/>
+          <w:szCs w:val="20"/>
+        </w:rPr>
+        <w:t xml:space="preserve"> — set a per-corridor emergency stop when necessary.</w:t>
+      </w:r>
+    </w:p>
+    <w:p>
+      <w:pPr>
+        <w:pStyle w:val="ListParagraph"/>
+        <w:numPr>
+          <w:ilvl w:val="0"/>
+          <w:numId w:val="2"/>
+        </w:numPr>
+        <w:spacing w:after="20"/>
+      </w:pPr>
+      <w:r>
+        <w:rPr>
+          <w:rFonts w:ascii="Calibri" w:cs="Calibri" w:eastAsia="Calibri" w:hAnsi="Calibri"/>
+          <w:b/>
+          <w:bCs/>
+          <w:color w:val="23201A"/>
+          <w:sz w:val="20"/>
+          <w:szCs w:val="20"/>
+        </w:rPr>
+        <w:t xml:space="preserve">Reports</w:t>
+      </w:r>
+      <w:r>
+        <w:rPr>
+          <w:rFonts w:ascii="Calibri" w:cs="Calibri" w:eastAsia="Calibri" w:hAnsi="Calibri"/>
+          <w:color w:val="23201A"/>
+          <w:sz w:val="20"/>
+          <w:szCs w:val="20"/>
+        </w:rPr>
+        <w:t xml:space="preserve"> — resolve 🚩 reported users/listings.</w:t>
+      </w:r>
+    </w:p>
+    <w:p>
+      <w:pPr>
+        <w:spacing w:after="140" w:before="60"/>
+      </w:pPr>
+      <w:r>
+        <w:drawing>
+          <wp:inline distT="0" distB="0" distL="0" distR="0">
+            <wp:extent cx="5334000" cy="3638550"/>
+            <wp:effectExtent t="0" r="0" b="0" l="0"/>
+            <wp:docPr id="1" name="" descr="" title=""/>
+            <wp:cNvGraphicFramePr>
+              <a:graphicFrameLocks xmlns:a="http://schemas.openxmlformats.org/drawingml/2006/main" noChangeAspect="1"/>
+            </wp:cNvGraphicFramePr>
+            <a:graphic xmlns:a="http://schemas.openxmlformats.org/drawingml/2006/main">
+              <a:graphicData uri="http://schemas.openxmlformats.org/drawingml/2006/picture">
+                <pic:pic xmlns:pic="http://schemas.openxmlformats.org/drawingml/2006/picture">
+                  <pic:nvPicPr>
+                    <pic:cNvPr id="0" name="" descr=""/>
+                    <pic:cNvPicPr>
+                      <a:picLocks noChangeAspect="1" noChangeArrowheads="1"/>
+                    </pic:cNvPicPr>
+                  </pic:nvPicPr>
+                  <pic:blipFill>
+                    <a:blip r:embed="rId17" cstate="none"/>
+                    <a:srcRect/>
+                    <a:stretch>
+                      <a:fillRect/>
+                    </a:stretch>
+                  </pic:blipFill>
+                  <pic:spPr bwMode="auto">
+                    <a:xfrm>
+                      <a:off x="0" y="0"/>
+                      <a:ext cx="5334000" cy="3638550"/>
+                    </a:xfrm>
+                    <a:prstGeom prst="rect">
+                      <a:avLst/>
+                    </a:prstGeom>
+                  </pic:spPr>
+                </pic:pic>
+              </a:graphicData>
+            </a:graphic>
+          </wp:inline>
+        </w:drawing>
+      </w:r>
+    </w:p>
+    <w:p>
+      <w:pPr>
+        <w:spacing w:after="40" w:before="150"/>
+      </w:pPr>
+      <w:r>
+        <w:rPr>
+          <w:rFonts w:ascii="Calibri" w:cs="Calibri" w:eastAsia="Calibri" w:hAnsi="Calibri"/>
+          <w:b/>
+          <w:bCs/>
+          <w:color w:val="4F7A1B"/>
+          <w:sz w:val="18"/>
+          <w:szCs w:val="18"/>
+        </w:rPr>
+        <w:t xml:space="preserve">Usage &amp; activity (dashboard)</w:t>
+      </w:r>
+    </w:p>
+    <w:p>
+      <w:pPr>
+        <w:pStyle w:val="ListParagraph"/>
+        <w:numPr>
+          <w:ilvl w:val="0"/>
+          <w:numId w:val="2"/>
+        </w:numPr>
+        <w:spacing w:after="20"/>
+      </w:pPr>
+      <w:r>
+        <w:rPr>
+          <w:rFonts w:ascii="Calibri" w:cs="Calibri" w:eastAsia="Calibri" w:hAnsi="Calibri"/>
+          <w:b/>
+          <w:bCs/>
+          <w:color w:val="23201A"/>
+          <w:sz w:val="20"/>
+          <w:szCs w:val="20"/>
+        </w:rPr>
+        <w:t xml:space="preserve">Active users</w:t>
+      </w:r>
+      <w:r>
+        <w:rPr>
+          <w:rFonts w:ascii="Calibri" w:cs="Calibri" w:eastAsia="Calibri" w:hAnsi="Calibri"/>
+          <w:color w:val="23201A"/>
+          <w:sz w:val="20"/>
+          <w:szCs w:val="20"/>
+        </w:rPr>
+        <w:t xml:space="preserve"> — see how many are active (24h/7d/30d) and who has been active, with last login and actions per member.</w:t>
+      </w:r>
+    </w:p>
+    <w:p>
+      <w:pPr>
+        <w:pStyle w:val="ListParagraph"/>
+        <w:numPr>
+          <w:ilvl w:val="0"/>
+          <w:numId w:val="2"/>
+        </w:numPr>
+        <w:spacing w:after="20"/>
+      </w:pPr>
+      <w:r>
+        <w:rPr>
+          <w:rFonts w:ascii="Calibri" w:cs="Calibri" w:eastAsia="Calibri" w:hAnsi="Calibri"/>
+          <w:b/>
+          <w:bCs/>
+          <w:color w:val="23201A"/>
+          <w:sz w:val="20"/>
+          <w:szCs w:val="20"/>
+        </w:rPr>
+        <w:t xml:space="preserve">Funnel &amp; behaviour</w:t>
+      </w:r>
+      <w:r>
+        <w:rPr>
+          <w:rFonts w:ascii="Calibri" w:cs="Calibri" w:eastAsia="Calibri" w:hAnsi="Calibri"/>
+          <w:color w:val="23201A"/>
+          <w:sz w:val="20"/>
+          <w:szCs w:val="20"/>
+        </w:rPr>
+        <w:t xml:space="preserve"> — follow the activity funnel (sign-up → … → delivery) and behaviour (page views, “check used”, clicks).</w:t>
+      </w:r>
+    </w:p>
+    <w:p>
+      <w:pPr>
+        <w:spacing w:after="140" w:before="60"/>
+      </w:pPr>
+      <w:r>
+        <w:drawing>
+          <wp:inline distT="0" distB="0" distL="0" distR="0">
+            <wp:extent cx="5334000" cy="3638550"/>
+            <wp:effectExtent t="0" r="0" b="0" l="0"/>
+            <wp:docPr id="1" name="" descr="" title=""/>
+            <wp:cNvGraphicFramePr>
+              <a:graphicFrameLocks xmlns:a="http://schemas.openxmlformats.org/drawingml/2006/main" noChangeAspect="1"/>
+            </wp:cNvGraphicFramePr>
+            <a:graphic xmlns:a="http://schemas.openxmlformats.org/drawingml/2006/main">
+              <a:graphicData uri="http://schemas.openxmlformats.org/drawingml/2006/picture">
+                <pic:pic xmlns:pic="http://schemas.openxmlformats.org/drawingml/2006/picture">
+                  <pic:nvPicPr>
+                    <pic:cNvPr id="0" name="" descr=""/>
+                    <pic:cNvPicPr>
+                      <a:picLocks noChangeAspect="1" noChangeArrowheads="1"/>
+                    </pic:cNvPicPr>
+                  </pic:nvPicPr>
+                  <pic:blipFill>
+                    <a:blip r:embed="rId18" cstate="none"/>
                     <a:srcRect/>
                     <a:stretch>
                       <a:fillRect/>

</xml_diff>